<commit_message>
Explain projection safeguards and exit-risk estimation in Doc 2
</commit_message>
<xml_diff>
--- a/40_DOCS/Supervisor_Drafts/Doc_2_Player_Pillar_I.docx
+++ b/40_DOCS/Supervisor_Drafts/Doc_2_Player_Pillar_I.docx
@@ -635,7 +635,7 @@
         </w:rPr>
       </w:pPr>
       <w:r>
-        <w:t>This final step keeps the player's recent total contribution as the starting point. Directly using the curve's 1.70 would substitute a performance rate based partly on comparable players for the season-total estimate on which the salary equation was fitted. The percentage change supplies the aging adjustment while retaining the player's own starting level, including the effect of games missed in the baseline seasons. Exit probabilities and dollar prices are applied separately.</w:t>
+        <w:t>The player's recent season totals determine where his projection starts; the aging curve determines how much it changes afterward. In this example, the curve supplies a 15% decline, which is applied to the player's own 1.6-win baseline. This keeps his recent contribution, including the effect of games missed, as the starting point. The chance of leaving the NHL is accounted for separately.</w:t>
       </w:r>
     </w:p>
     <w:p>
@@ -682,24 +682,62 @@
         </w:rPr>
       </w:pPr>
       <w:r>
-        <w:rPr>
-          <w:rFonts w:asciiTheme="minorHAnsi" w:hAnsiTheme="minorHAnsi" w:cstheme="minorHAnsi"/>
-        </w:rPr>
-        <w:t>Dividing by a curve level near zero can produce an extreme growth rate. If the curve's starting level is 0.25 wins or less, the model holds the baseline flat. It also uses a flat path when no usable curve is available. Otherwise, the curve multiplier is bounded between zero and three. Beyond the observed age range, it holds the last available multiplier.</w:t>
-      </w:r>
-    </w:p>
-    <w:p>
-      <w:pPr>
-        <w:spacing w:after="200"/>
-        <w:rPr>
-          <w:rFonts w:asciiTheme="minorHAnsi" w:hAnsiTheme="minorHAnsi" w:cstheme="minorHAnsi"/>
-        </w:rPr>
-      </w:pPr>
-      <w:r>
-        <w:rPr>
-          <w:rFonts w:asciiTheme="minorHAnsi" w:hAnsiTheme="minorHAnsi" w:cstheme="minorHAnsi"/>
-        </w:rPr>
-        <w:t>A negative baseline gets separate treatment. The valuation season keeps that negative estimate; later seasons move to zero WAR, or replacement level. This prevents a declining ratio from making a negative player appear to improve through multiplication, or from projecting increasingly negative production far into the future.</w:t>
+        <w:t>Several limits prevent the ratio calculation from producing extreme projections. These are chosen modeling safeguards rather than estimated aging parameters. If the curve's level in the valuation season is 0.25 wins per 82 games or less, the model holds the player's production baseline constant instead of calculating percentage changes from that small number. For example, moving from 0.10 to 0.30 is a small gain in wins but a tripling in percentage terms. Applying that percentage to a much larger production baseline could create an implausible forecast.</w:t>
+      </w:r>
+    </w:p>
+    <w:p>
+      <w:pPr>
+        <w:spacing w:after="200"/>
+        <w:rPr>
+          <w:rFonts w:asciiTheme="minorHAnsi" w:hAnsiTheme="minorHAnsi" w:cstheme="minorHAnsi"/>
+        </w:rPr>
+      </w:pPr>
+      <w:r>
+        <w:t>The 0.25 cutoff was not selected by testing which threshold best predicts future production. A later review considered raising it to 0.40, but the recorded diagnostic did not support that change: it would have sent additional contracts onto flat projections without fixing most of the negative-ratio cases under review. That check supports retaining the existing safeguard over that proposed change; it does not establish that 0.25 is the optimal cutoff.</w:t>
+      </w:r>
+    </w:p>
+    <w:p>
+      <w:pPr>
+        <w:spacing w:after="200"/>
+        <w:rPr>
+          <w:rFonts w:asciiTheme="minorHAnsi" w:hAnsiTheme="minorHAnsi" w:cstheme="minorHAnsi"/>
+        </w:rPr>
+      </w:pPr>
+      <w:r>
+        <w:t>For curves that pass the starting-level check, the multiplier is capped at three, so projected production cannot exceed three times the player's baseline through this calculation. Three is a chosen upper limit, not an estimated maximum growth rate. It did not constrain any rows in the recorded review. The multiplier is also floored at zero, preventing a positive starting estimate from turning negative when the fitted curve falls below zero. That floor expresses the model's replacement-level convention; it is not a claim that below-replacement seasons cannot occur.</w:t>
+      </w:r>
+    </w:p>
+    <w:p>
+      <w:pPr>
+        <w:spacing w:after="200"/>
+        <w:rPr>
+          <w:rFonts w:asciiTheme="minorHAnsi" w:hAnsiTheme="minorHAnsi" w:cstheme="minorHAnsi"/>
+        </w:rPr>
+      </w:pPr>
+      <w:r>
+        <w:t>The remaining flat projections are fallbacks for missing evidence. If no usable curve can be constructed, the baseline is held constant. If the contract extends beyond the ages covered by the curve, the last available multiplier is carried forward. Neither rule is an empirical finding that the player stops aging.</w:t>
+      </w:r>
+    </w:p>
+    <w:p>
+      <w:pPr>
+        <w:spacing w:after="200"/>
+        <w:rPr>
+          <w:rFonts w:asciiTheme="minorHAnsi" w:hAnsiTheme="minorHAnsi" w:cstheme="minorHAnsi"/>
+        </w:rPr>
+      </w:pPr>
+      <w:r>
+        <w:t>A negative production baseline gets separate treatment because ordinary percentage changes behave misleadingly below zero. For example, suppose the baseline is -0.5 wins and the aging curve implies a 10% decline. Multiplying -0.5 by 0.90 gives -0.45, which is an improvement toward zero. Conversely, multiplying by 1.20, a factor that would improve a positive player by 20%, gives -0.60 and makes this player's projection worse.</w:t>
+      </w:r>
+    </w:p>
+    <w:p>
+      <w:pPr>
+        <w:spacing w:after="200"/>
+        <w:rPr>
+          <w:rFonts w:asciiTheme="minorHAnsi" w:hAnsiTheme="minorHAnsi" w:cstheme="minorHAnsi"/>
+        </w:rPr>
+      </w:pPr>
+      <w:r>
+        <w:t>The model therefore keeps the -0.5 estimate in the valuation season and projects zero WAR in each later season. Zero WAR means replacement-level production. This rule does not come from estimating a percentage decline for negative players; it was chosen after comparing ways of handling those baselines. The backcast results below provide the evidence for that choice. The same zero floor applied to declining positive baselines is a related modeling convention, not a separately estimated boundary.</w:t>
       </w:r>
     </w:p>
     <w:p>
@@ -782,24 +820,51 @@
         </w:rPr>
       </w:pPr>
       <w:r>
-        <w:rPr>
-          <w:rFonts w:asciiTheme="minorHAnsi" w:hAnsiTheme="minorHAnsi" w:cstheme="minorHAnsi"/>
-        </w:rPr>
-        <w:t>The estimate uses transitions from 2018 through 2024. It groups players by age and by that season's production: negative WAR, zero to one win, one to three wins, and at least three wins. A statistical model combines the age and quality effects, smoothing probabilities that would otherwise depend on a few departures in small groups. The available test did not establish a need for separate age effects within every quality group; it did not prove those differences are absent.</w:t>
-      </w:r>
-    </w:p>
-    <w:p>
-      <w:pPr>
-        <w:spacing w:after="200"/>
-        <w:rPr>
-          <w:rFonts w:asciiTheme="minorHAnsi" w:hAnsiTheme="minorHAnsi" w:cstheme="minorHAnsi"/>
-        </w:rPr>
-      </w:pPr>
-      <w:r>
-        <w:rPr>
-          <w:rFonts w:asciiTheme="minorHAnsi" w:hAnsiTheme="minorHAnsi" w:cstheme="minorHAnsi"/>
-        </w:rPr>
-        <w:t>The age groups are 22 and under, 23-26, 27-30, 31-34, and 35 or older. Together with the four quality groups, they form twenty cells. The recorded estimation sample contains 5,346 skater transitions. Some star cells had no observed departures, but assigning those cells zero risk would turn a small sample into certainty that a player continues. The fitted model shares information across the cells instead. It estimates age and quality effects without a separate coefficient for every combination.</w:t>
+        <w:t>The exit model uses transitions from 2018 through 2024. It groups players by that season's production: below zero WAR, zero to less than one win, one to less than three wins, and at least three wins. It also divides them into five age groups: 22 and under, 23-26, 27-30, 31-34, and 35 or older. There are therefore twenty possible age-and-quality combinations.</w:t>
+      </w:r>
+    </w:p>
+    <w:p>
+      <w:pPr>
+        <w:spacing w:after="200"/>
+        <w:rPr>
+          <w:rFonts w:asciiTheme="minorHAnsi" w:hAnsiTheme="minorHAnsi" w:cstheme="minorHAnsi"/>
+        </w:rPr>
+      </w:pPr>
+      <w:r>
+        <w:t>One way to estimate risk would be to calculate a separate departure rate for each combination. For example, among star players aged 31-34, none of the forty observed player-seasons was followed by an NHL absence. Using that group's departure count alone would assign it zero exit risk. Forty observations with no departure are not enough to establish that a future player in this group is certain to continue.</w:t>
+      </w:r>
+    </w:p>
+    <w:p>
+      <w:pPr>
+        <w:spacing w:after="200"/>
+        <w:rPr>
+          <w:rFonts w:asciiTheme="minorHAnsi" w:hAnsiTheme="minorHAnsi" w:cstheme="minorHAnsi"/>
+        </w:rPr>
+      </w:pPr>
+      <w:r>
+        <w:t>The model instead estimates the relationship between quality and exit across the age groups, and the relationship between age and exit across the quality groups. These relationships are fitted together. A star aged 31-34 is therefore informed by the wider evidence about stars and about players in that age group, rather than only the forty observations at their intersection. The fitted exit probability for this group is about 1.2% a year.</w:t>
+      </w:r>
+    </w:p>
+    <w:p>
+      <w:pPr>
+        <w:spacing w:after="200"/>
+        <w:rPr>
+          <w:rFonts w:asciiTheme="minorHAnsi" w:hAnsiTheme="minorHAnsi" w:cstheme="minorHAnsi"/>
+        </w:rPr>
+      </w:pPr>
+      <w:r>
+        <w:t>This is a logistic model, which converts the estimated age and quality relationships into probabilities between zero and one. It uses a common age pattern across quality groups, applied at their different underlying levels of risk. It does not give each quality group a separately fitted age pattern. An age-group adjustment can still produce a different change in exit probability for stars than for fringe players because their starting risks differ.</w:t>
+      </w:r>
+    </w:p>
+    <w:p>
+      <w:pPr>
+        <w:spacing w:after="200"/>
+        <w:rPr>
+          <w:rFonts w:asciiTheme="minorHAnsi" w:hAnsiTheme="minorHAnsi" w:cstheme="minorHAnsi"/>
+        </w:rPr>
+      </w:pPr>
+      <w:r>
+        <w:t>A comparison with a more flexible model allowed the age pattern to differ by quality group. The extra flexibility did not improve the fit enough to justify it in the recorded test (p = 0.955), so the simpler model was retained. That result means the data did not provide evidence for those additional differences; it does not prove that stars and fringe players age identically in their exit risk. The transition sample contains 5,346 observations, of which 5,344 have the age information used in this fit. Players with unknown age use the overall observed departure rate for their quality group.</w:t>
       </w:r>
     </w:p>
     <w:p>

</xml_diff>

<commit_message>
Clarify aging methods and correct stability-test scope in supervisor docs
</commit_message>
<xml_diff>
--- a/40_DOCS/Supervisor_Drafts/Doc_2_Player_Pillar_I.docx
+++ b/40_DOCS/Supervisor_Drafts/Doc_2_Player_Pillar_I.docx
@@ -38,84 +38,18 @@
         </w:rPr>
       </w:pPr>
       <w:r>
-        <w:rPr>
-          <w:rFonts w:asciiTheme="minorHAnsi" w:hAnsiTheme="minorHAnsi" w:cstheme="minorHAnsi"/>
-        </w:rPr>
-        <w:t xml:space="preserve">A player's </w:t>
-      </w:r>
-      <w:r>
-        <w:rPr>
-          <w:rFonts w:asciiTheme="minorHAnsi" w:hAnsiTheme="minorHAnsi" w:cstheme="minorHAnsi"/>
-        </w:rPr>
-        <w:t xml:space="preserve">net </w:t>
-      </w:r>
-      <w:r>
-        <w:rPr>
-          <w:rFonts w:asciiTheme="minorHAnsi" w:hAnsiTheme="minorHAnsi" w:cstheme="minorHAnsi"/>
-        </w:rPr>
-        <w:t xml:space="preserve">contract value starts with an estimate of what he will produce. For skaters, the model uses Bacon's wins above replacement (WAR), projects that production through the remaining </w:t>
-      </w:r>
-      <w:r>
-        <w:rPr>
-          <w:rFonts w:asciiTheme="minorHAnsi" w:hAnsiTheme="minorHAnsi" w:cstheme="minorHAnsi"/>
-        </w:rPr>
-        <w:t>term of team control</w:t>
-      </w:r>
-      <w:r>
-        <w:rPr>
-          <w:rFonts w:asciiTheme="minorHAnsi" w:hAnsiTheme="minorHAnsi" w:cstheme="minorHAnsi"/>
-        </w:rPr>
-        <w:t>, accounts separately for the chance that the player leaves the NHL</w:t>
-      </w:r>
-      <w:r>
-        <w:rPr>
-          <w:rFonts w:asciiTheme="minorHAnsi" w:hAnsiTheme="minorHAnsi" w:cstheme="minorHAnsi"/>
-        </w:rPr>
-        <w:t>, and is discounted to present value</w:t>
-      </w:r>
-      <w:r>
-        <w:rPr>
-          <w:rFonts w:asciiTheme="minorHAnsi" w:hAnsiTheme="minorHAnsi" w:cstheme="minorHAnsi"/>
-        </w:rPr>
-        <w:t>. The dollar price and contract costs enter in Document 3.</w:t>
-      </w:r>
-    </w:p>
-    <w:p>
-      <w:pPr>
-        <w:spacing w:after="200"/>
-        <w:rPr>
-          <w:rFonts w:asciiTheme="minorHAnsi" w:hAnsiTheme="minorHAnsi" w:cstheme="minorHAnsi"/>
-        </w:rPr>
-      </w:pPr>
-      <w:r>
-        <w:rPr>
-          <w:rFonts w:asciiTheme="minorHAnsi" w:hAnsiTheme="minorHAnsi" w:cstheme="minorHAnsi"/>
-        </w:rPr>
-        <w:t>The starting estimate uses completed seasons before the valuation season. That keeps the player's current form out of his own baseline</w:t>
-      </w:r>
-      <w:r>
-        <w:rPr>
-          <w:rFonts w:asciiTheme="minorHAnsi" w:hAnsiTheme="minorHAnsi" w:cstheme="minorHAnsi"/>
-        </w:rPr>
-        <w:t xml:space="preserve"> projection</w:t>
-      </w:r>
-      <w:r>
-        <w:rPr>
-          <w:rFonts w:asciiTheme="minorHAnsi" w:hAnsiTheme="minorHAnsi" w:cstheme="minorHAnsi"/>
-        </w:rPr>
-        <w:t xml:space="preserve">. </w:t>
-      </w:r>
-      <w:r>
-        <w:rPr>
-          <w:rFonts w:asciiTheme="minorHAnsi" w:hAnsiTheme="minorHAnsi" w:cstheme="minorHAnsi"/>
-        </w:rPr>
-        <w:t>Player production is determined at the time of evaluation, however, a</w:t>
-      </w:r>
-      <w:r>
-        <w:rPr>
-          <w:rFonts w:asciiTheme="minorHAnsi" w:hAnsiTheme="minorHAnsi" w:cstheme="minorHAnsi"/>
-        </w:rPr>
-        <w:t>ging curves and exit probabilities are estimated using a shared historical sample, including seasons after some valuation dates.</w:t>
+        <w:t>A player's net contract value starts with an estimate of what he will produce. For skaters, the model uses Bacon's wins above replacement (WAR) and projects that production through the remaining term of team control. It accounts separately for the chance that the player leaves the NHL. The player-pricing document explains how projected production is priced, contract costs are deducted, and future amounts are discounted to present value.</w:t>
+      </w:r>
+    </w:p>
+    <w:p>
+      <w:pPr>
+        <w:spacing w:after="200"/>
+        <w:rPr>
+          <w:rFonts w:asciiTheme="minorHAnsi" w:hAnsiTheme="minorHAnsi" w:cstheme="minorHAnsi"/>
+        </w:rPr>
+      </w:pPr>
+      <w:r>
+        <w:t>The starting estimate uses seasons completed before the valuation season. For example, a valuation for 2025-26 draws on the player's production in 2024-25 and 2023-24. The aging curves and exit probabilities use a shared historical sample, which includes seasons after some valuation dates. The player's starting information and the information used to estimate these broader patterns therefore have different time limits.</w:t>
       </w:r>
     </w:p>
     <w:p>
@@ -202,10 +136,7 @@
         </w:rPr>
       </w:pPr>
       <w:r>
-        <w:rPr>
-          <w:rFonts w:asciiTheme="minorHAnsi" w:hAnsiTheme="minorHAnsi" w:cstheme="minorHAnsi"/>
-        </w:rPr>
-        <w:t xml:space="preserve">The contract database's player identifier is the main entity key. A separate shared identifier connects clause records, and the NHL identifier connects game-level records. These are different joins, not interchangeable labels for the same field. </w:t>
+        <w:t>The contract database's player identifier is the main entity key, while a separate shared identifier connects clause records and the NHL identifier connects game-level records. Each identifier serves a different join.</w:t>
       </w:r>
     </w:p>
     <w:p>
@@ -230,10 +161,7 @@
         </w:rPr>
       </w:pPr>
       <w:r>
-        <w:rPr>
-          <w:rFonts w:asciiTheme="minorHAnsi" w:hAnsiTheme="minorHAnsi" w:cstheme="minorHAnsi"/>
-        </w:rPr>
-        <w:t xml:space="preserve">The recorded trade inventory contains 980 export rows grouped into 946 events, including linked legs of facilitated transactions. The export begins effectively in 2018, leaving little of the intended 2017-18 window. Its completeness has not been checked against an independent trade source. </w:t>
+        <w:t>The trade inventory contains 980 export rows grouped into 946 events, including linked legs of facilitated transactions. There is only one trade from the intended 2017-18 season, dated June 23, 2018, so coverage effectively begins in 2018-19. Completeness has not been checked against an independent trade source.</w:t>
       </w:r>
     </w:p>
     <w:p>
@@ -317,6 +245,20 @@
     </w:p>
     <w:p>
       <w:pPr>
+        <w:spacing w:after="200"/>
+        <w:rPr>
+          <w:rFonts w:asciiTheme="minorHAnsi" w:hAnsiTheme="minorHAnsi" w:cstheme="minorHAnsi"/>
+        </w:rPr>
+      </w:pPr>
+      <w:r>
+        <w:rPr>
+          <w:rFonts w:asciiTheme="minorHAnsi" w:hAnsiTheme="minorHAnsi" w:cstheme="minorHAnsi"/>
+        </w:rPr>
+        <w:t>The projection also responds slowly to breakouts. A strong season in progress cannot enter a baseline restricted to completed seasons. That protects the historical information rule while leaving the model behind a club that has already seen convincing improvement.</w:t>
+      </w:r>
+    </w:p>
+    <w:p>
+      <w:pPr>
         <w:pStyle w:val="Heading2"/>
         <w:keepNext/>
         <w:spacing w:before="280" w:after="140"/>
@@ -381,7 +323,7 @@
         </w:rPr>
       </w:pPr>
       <w:r>
-        <w:t>The aging data require at least twenty games in a season. A profile in the comparable-player pool also needs two consecutive qualifying seasons, because it describes recent form and the change from one year to the next. A gap between ages 24 and 27 cannot be treated as a one-year change. The player being valued can use a single-season profile when his preceding season is missing; the comparable pool retains its two-season requirement. If neither of his two preceding seasons can supply a usable curve, the projection uses the fallback described in Section 4.</w:t>
+        <w:t>The aging data require at least twenty games in a season, compared with ten for the production baseline. A season with ten to nineteen games can therefore contribute to the baseline while being unavailable for the aging profile. The model then tries the season before it; if neither preceding season supplies a usable curve, it holds the baseline flat. Twenty games is the model's eligibility threshold, with no claim that it is the best possible cutoff. A profile in the comparable-player pool also requires two consecutive qualifying seasons to describe recent form and year-to-year change. The target can use a single-season profile when his earlier season is missing; its trend is then set to zero.</w:t>
       </w:r>
     </w:p>
     <w:p>
@@ -401,7 +343,7 @@
         </w:rPr>
       </w:pPr>
       <w:r>
-        <w:t>Each profile contains eight measures. Five describe playing style using the player's even-strength offensive, even-strength defensive, power-play, penalty-killing, and shooting contributions. The other three describe ice time per game, recent production, and whether production has been rising or falling.</w:t>
+        <w:t>Each profile contains eight measures. Five describe playing style using even-strength offense, even-strength defense, power-play, penalty-killing, and shooting contributions. Each component is divided by the sum of the absolute values of those five components, retaining its positive or negative sign. This describes the mix of contributions separately from the player's overall production level. Penalty contributions are excluded from both the style measures and their denominator; the code documents this choice as avoiding compositional collinearity, or redundancy among component shares. The other three measures describe ice time per game, recent production, and whether production has been rising or falling.</w:t>
       </w:r>
     </w:p>
     <w:p>
@@ -434,7 +376,7 @@
         </w:rPr>
       </w:pPr>
       <w:r>
-        <w:t>The five style measures together receive the same total importance as ice time, production level, or trend. These are four equally weighted groups. The measures are first put on comparable numerical scales within position, so a difference measured in minutes does not dominate one measured in wins merely because the numbers are larger. The relative group weights are an assumption; they have not been systematically tested against alternatives.</w:t>
+        <w:t>The five style measures share one group's weight. Ice time, production level, and trend each receive the same total weight separately. These assigned weights do not mean each group contributes equally to the distance between a particular pair of players: identical ice time, for example, contributes no distance. Before applying the weights, the measures are put on comparable numerical scales within position so that minutes do not dominate wins simply because the numbers are larger. The equal group weights are a modeling choice that has not been systematically compared with alternatives.</w:t>
       </w:r>
     </w:p>
     <w:p>
@@ -454,18 +396,40 @@
         </w:rPr>
       </w:pPr>
       <w:r>
-        <w:t>The model calculates a similarity score from the differences between the profiles. In the code, this is called a distance: a small distance means the players resemble each other on the measured attributes. Forwards are compared with forwards and defencemen with defencemen, at the same age. There is no fixed shortlist of five or ten comparables. Each eligible profile receives a weight, with closer matches receiving more influence.</w:t>
-      </w:r>
-    </w:p>
-    <w:p>
-      <w:pPr>
-        <w:spacing w:after="200"/>
-        <w:rPr>
-          <w:rFonts w:asciiTheme="minorHAnsi" w:hAnsiTheme="minorHAnsi" w:cstheme="minorHAnsi"/>
-        </w:rPr>
-      </w:pPr>
-      <w:r>
-        <w:t>The weight falls smoothly as the profiles become less alike. To decide how quickly it should fall, the model measures the distances between sampled pairs of profiles within each position and takes the median across those distances. That median is the reference distance. An exact match has weight 1; a profile one reference distance away receives about 0.61, and one twice as far away receives about 0.14. These weights determine influence on the average. They are not probabilities that a player will follow a particular career.</w:t>
+        <w:t>The model compares the target player with historical players of the same age and position. It measures how different their profiles are, using the attributes described above. This difference is called a distance. A smaller distance means a closer match. There is no fixed number of comparables: each eligible profile receives a weight, with closer matches contributing more to the projection.</w:t>
+      </w:r>
+    </w:p>
+    <w:p>
+      <w:pPr>
+        <w:spacing w:after="200"/>
+        <w:rPr>
+          <w:rFonts w:asciiTheme="minorHAnsi" w:hAnsiTheme="minorHAnsi" w:cstheme="minorHAnsi"/>
+        </w:rPr>
+      </w:pPr>
+      <w:r>
+        <w:t>The model needs a yardstick to judge whether a distance is small or large. It calculates distances between sampled pairs of forward profiles and between sampled pairs of defence profiles, pools those distances, and takes their median. This produces one shared yardstick for both positions. The pairs used to build it can come from different ages, although the target's actual comparables remain restricted to his age and position.</w:t>
+      </w:r>
+    </w:p>
+    <w:p>
+      <w:pPr>
+        <w:spacing w:after="200"/>
+        <w:rPr>
+          <w:rFonts w:asciiTheme="minorHAnsi" w:hAnsiTheme="minorHAnsi" w:cstheme="minorHAnsi"/>
+        </w:rPr>
+      </w:pPr>
+      <w:r>
+        <w:t>The target player determines which comparables are closest, while the shared yardstick determines how quickly their weights fall as they become less similar. An exact match receives a weight of 1. A comparable one yardstick away receives about 0.61, and one twice as far away receives about 0.14. These are weights in an average, rather than probabilities of following a particular career.</w:t>
+      </w:r>
+    </w:p>
+    <w:p>
+      <w:pPr>
+        <w:spacing w:after="200"/>
+        <w:rPr>
+          <w:rFonts w:asciiTheme="minorHAnsi" w:hAnsiTheme="minorHAnsi" w:cstheme="minorHAnsi"/>
+        </w:rPr>
+      </w:pPr>
+      <w:r>
+        <w:t>We also tested a variant that calculated a separate yardstick for each target, using the median distance from that player to the eligible comparables. It produced slightly larger prediction errors, so the model retains the shared yardstick.</w:t>
       </w:r>
     </w:p>
     <w:p>
@@ -560,18 +524,18 @@
         </w:rPr>
       </w:pPr>
       <w:r>
-        <w:t>This is the meaning of measuring aging within players: compare a player with himself one year later, then average those changes. Comparing two separate groups of 25-year-olds and 26-year-olds could give a different answer because some weaker players leave between those ages. The average among the remaining 26-year-olds could rise even if none of those individuals improved.</w:t>
-      </w:r>
-    </w:p>
-    <w:p>
-      <w:pPr>
-        <w:spacing w:after="200"/>
-        <w:rPr>
-          <w:rFonts w:asciiTheme="minorHAnsi" w:hAnsiTheme="minorHAnsi" w:cstheme="minorHAnsi"/>
-        </w:rPr>
-      </w:pPr>
-      <w:r>
-        <w:t>The adjustment does not eliminate selection. Measuring a change from 25 to 26 requires a player to be observed at both ages. A comparable who leaves the league contributes no observed change for that transition. The aging curve therefore describes changes among continuing players; the separate exit model estimates the chance that the player being valued stops appearing in the NHL.</w:t>
+        <w:t>Measuring aging within players means comparing each player with himself one year later, then averaging the changes. Comparing separate groups of 25-year-olds and 26-year-olds can give a different answer because some weaker players leave between those ages. The average among the remaining 26-year-olds could rise even if none of those individuals improved.</w:t>
+      </w:r>
+    </w:p>
+    <w:p>
+      <w:pPr>
+        <w:spacing w:after="200"/>
+        <w:rPr>
+          <w:rFonts w:asciiTheme="minorHAnsi" w:hAnsiTheme="minorHAnsi" w:cstheme="minorHAnsi"/>
+        </w:rPr>
+      </w:pPr>
+      <w:r>
+        <w:t>Measuring aging within players still depends on who remains in the data. A change from age 25 to 26 can be measured only for a player observed at both ages. A comparable who leaves the league contributes no observed change for that transition. The aging curve therefore describes changes among continuing players; the separate exit model estimates the chance that the target stops appearing in the NHL.</w:t>
       </w:r>
     </w:p>
     <w:p>
@@ -613,7 +577,7 @@
         </w:rPr>
       </w:pPr>
       <w:r>
-        <w:t>Suppose the combined age changes are minus 0.18 wins from 25 to 26 and minus 0.30 from 26 to 27. Starting from 2.18, the curve reaches 2.00 at age 26 and 1.70 at age 27. These figures are illustrative inputs chosen to show the calculation, not estimated results for a named player.</w:t>
+        <w:t>Continue the illustrative example with combined age changes of minus 0.18 wins from 25 to 26 and minus 0.30 from 26 to 27. Starting from 2.18, the curve reaches 2.00 at age 26 and 1.70 at age 27. These are hypothetical inputs used to show the calculation.</w:t>
       </w:r>
     </w:p>
     <w:p>
@@ -644,18 +608,40 @@
         <w:keepNext/>
       </w:pPr>
       <w:r>
-        <w:t>What information still enters from later seasons</w:t>
-      </w:r>
-    </w:p>
-    <w:p>
-      <w:pPr>
-        <w:spacing w:after="200"/>
-        <w:rPr>
-          <w:rFonts w:asciiTheme="minorHAnsi" w:hAnsiTheme="minorHAnsi" w:cstheme="minorHAnsi"/>
-        </w:rPr>
-      </w:pPr>
-      <w:r>
-        <w:t>The player's own career receives zero weight among his direct comparables. However, the broader position-and-age averages are calculated from the full historical panel, including his career. His later seasons can enter through those averages, and later seasons from other players also influence the fitted curve. The player's profile is dated before the valuation season, but the fitted aging model is not restricted to information available at each historical valuation date. The size of that remaining exposure has not been measured.</w:t>
+        <w:t>Identify information that still enters from later seasons</w:t>
+      </w:r>
+    </w:p>
+    <w:p>
+      <w:pPr>
+        <w:spacing w:after="200"/>
+        <w:rPr>
+          <w:rFonts w:asciiTheme="minorHAnsi" w:hAnsiTheme="minorHAnsi" w:cstheme="minorHAnsi"/>
+        </w:rPr>
+      </w:pPr>
+      <w:r>
+        <w:t>The player's own career receives zero weight among his direct comparables. However, the broader position-and-age averages use the full historical panel, including his career. His later seasons can enter those averages, and later seasons from other players also influence the fitted curve. The target's profile is dated before the valuation season, while the fitted aging model uses a broader information set.</w:t>
+      </w:r>
+    </w:p>
+    <w:p>
+      <w:pPr>
+        <w:spacing w:after="200"/>
+        <w:rPr>
+          <w:rFonts w:asciiTheme="minorHAnsi" w:hAnsiTheme="minorHAnsi" w:cstheme="minorHAnsi"/>
+        </w:rPr>
+      </w:pPr>
+      <w:r>
+        <w:t>A split-period check compared observed year-to-year changes in WAR per 82 games for the same players, grouped by age and position, in 2007-2015 and 2016-2025. Differences were detected at none of sixteen forward ages and one of sixteen defence ages. This provides limited evidence of changes in the observed aging pattern between eras. The check did not compare the fitted projection models or measure how much full-panel estimation changes historical contract values.</w:t>
+      </w:r>
+    </w:p>
+    <w:p>
+      <w:pPr>
+        <w:spacing w:after="200"/>
+        <w:rPr>
+          <w:rFonts w:asciiTheme="minorHAnsi" w:hAnsiTheme="minorHAnsi" w:cstheme="minorHAnsi"/>
+        </w:rPr>
+      </w:pPr>
+      <w:r>
+        <w:t>The later yardstick comparison excluded entire target careers from training and also tested historical training windows. It assessed which yardstick predicted better under those conditions. It did not isolate the effect of the remaining full-panel exposure on production valuations, which remains unmeasured.</w:t>
       </w:r>
     </w:p>
     <w:p>
@@ -682,40 +668,40 @@
         </w:rPr>
       </w:pPr>
       <w:r>
-        <w:t>Several limits prevent the ratio calculation from producing extreme projections. These are chosen modeling safeguards rather than estimated aging parameters. If the curve's level in the valuation season is 0.25 wins per 82 games or less, the model holds the player's production baseline constant instead of calculating percentage changes from that small number. For example, moving from 0.10 to 0.30 is a small gain in wins but a tripling in percentage terms. Applying that percentage to a much larger production baseline could create an implausible forecast.</w:t>
-      </w:r>
-    </w:p>
-    <w:p>
-      <w:pPr>
-        <w:spacing w:after="200"/>
-        <w:rPr>
-          <w:rFonts w:asciiTheme="minorHAnsi" w:hAnsiTheme="minorHAnsi" w:cstheme="minorHAnsi"/>
-        </w:rPr>
-      </w:pPr>
-      <w:r>
-        <w:t>The 0.25 cutoff was not selected by testing which threshold best predicts future production. A later review considered raising it to 0.40, but the recorded diagnostic did not support that change: it would have sent additional contracts onto flat projections without fixing most of the negative-ratio cases under review. That check supports retaining the existing safeguard over that proposed change; it does not establish that 0.25 is the optimal cutoff.</w:t>
-      </w:r>
-    </w:p>
-    <w:p>
-      <w:pPr>
-        <w:spacing w:after="200"/>
-        <w:rPr>
-          <w:rFonts w:asciiTheme="minorHAnsi" w:hAnsiTheme="minorHAnsi" w:cstheme="minorHAnsi"/>
-        </w:rPr>
-      </w:pPr>
-      <w:r>
-        <w:t>For curves that pass the starting-level check, the multiplier is capped at three, so projected production cannot exceed three times the player's baseline through this calculation. Three is a chosen upper limit, not an estimated maximum growth rate. It did not constrain any rows in the recorded review. The multiplier is also floored at zero, preventing a positive starting estimate from turning negative when the fitted curve falls below zero. That floor expresses the model's replacement-level convention; it is not a claim that below-replacement seasons cannot occur.</w:t>
-      </w:r>
-    </w:p>
-    <w:p>
-      <w:pPr>
-        <w:spacing w:after="200"/>
-        <w:rPr>
-          <w:rFonts w:asciiTheme="minorHAnsi" w:hAnsiTheme="minorHAnsi" w:cstheme="minorHAnsi"/>
-        </w:rPr>
-      </w:pPr>
-      <w:r>
-        <w:t>The remaining flat projections are fallbacks for missing evidence. If no usable curve can be constructed, the baseline is held constant. If the contract extends beyond the ages covered by the curve, the last available multiplier is carried forward. Neither rule is an empirical finding that the player stops aging.</w:t>
+        <w:t>Several limits prevent the ratio calculation from producing extreme projections. The 0.25 starting-level cutoff, upper multiplier of three, and zero floor are chosen safeguards. If the curve's level in the valuation season is 0.25 wins per 82 games or less, the model holds the player's production baseline constant. For example, moving from 0.10 to 0.30 is a small gain in wins but a tripling in percentage terms. Applying that percentage to a much larger baseline could create an implausible forecast.</w:t>
+      </w:r>
+    </w:p>
+    <w:p>
+      <w:pPr>
+        <w:spacing w:after="200"/>
+        <w:rPr>
+          <w:rFonts w:asciiTheme="minorHAnsi" w:hAnsiTheme="minorHAnsi" w:cstheme="minorHAnsi"/>
+        </w:rPr>
+      </w:pPr>
+      <w:r>
+        <w:t>The 0.25 cutoff was not selected by testing which threshold best predicts future production. A later review considered raising it to 0.40, but that change would have sent additional contracts onto flat projections without fixing most of the negative-ratio cases under review. The comparison supported retaining 0.25 over that proposal; the optimal cutoff remains unknown.</w:t>
+      </w:r>
+    </w:p>
+    <w:p>
+      <w:pPr>
+        <w:spacing w:after="200"/>
+        <w:rPr>
+          <w:rFonts w:asciiTheme="minorHAnsi" w:hAnsiTheme="minorHAnsi" w:cstheme="minorHAnsi"/>
+        </w:rPr>
+      </w:pPr>
+      <w:r>
+        <w:t>For curves that pass the starting-level check, the multiplier is capped at three, limiting projected production to three times the baseline. This cap constrained no rows in the review. The multiplier is also floored at zero, so a positive starting estimate can decline to replacement level but cannot become negative through this calculation. Actual below-replacement seasons remain possible.</w:t>
+      </w:r>
+    </w:p>
+    <w:p>
+      <w:pPr>
+        <w:spacing w:after="200"/>
+        <w:rPr>
+          <w:rFonts w:asciiTheme="minorHAnsi" w:hAnsiTheme="minorHAnsi" w:cstheme="minorHAnsi"/>
+        </w:rPr>
+      </w:pPr>
+      <w:r>
+        <w:t>If no usable curve can be constructed, the model holds the baseline constant. If the contract extends beyond the ages covered by the curve, it carries forward the last available multiplier. These flat paths are fallbacks for missing evidence about further changes.</w:t>
       </w:r>
     </w:p>
     <w:p>
@@ -737,49 +723,29 @@
         </w:rPr>
       </w:pPr>
       <w:r>
-        <w:t>The model therefore keeps the -0.5 estimate in the valuation season and projects zero WAR in each later season. Zero WAR means replacement-level production. This rule does not come from estimating a percentage decline for negative players; it was chosen after comparing ways of handling those baselines. The backcast results below provide the evidence for that choice. The same zero floor applied to declining positive baselines is a related modeling convention, not a separately estimated boundary.</w:t>
-      </w:r>
-    </w:p>
-    <w:p>
-      <w:pPr>
-        <w:spacing w:after="200"/>
-        <w:rPr>
-          <w:rFonts w:asciiTheme="minorHAnsi" w:hAnsiTheme="minorHAnsi" w:cstheme="minorHAnsi"/>
-        </w:rPr>
-      </w:pPr>
-      <w:r>
-        <w:rPr>
-          <w:rFonts w:asciiTheme="minorHAnsi" w:hAnsiTheme="minorHAnsi" w:cstheme="minorHAnsi"/>
-        </w:rPr>
-        <w:t>The supporting rebound evidence concerns players who continued playing. It cannot show what happened to those who disappeared from the data, and it does not remove their exit risk. Zero WAR also does not mean zero dollar value: the pricing equation assigns a positive price to replacement-level production.</w:t>
-      </w:r>
-    </w:p>
-    <w:p>
-      <w:pPr>
-        <w:spacing w:after="200"/>
-        <w:rPr>
-          <w:rFonts w:asciiTheme="minorHAnsi" w:hAnsiTheme="minorHAnsi" w:cstheme="minorHAnsi"/>
-        </w:rPr>
-      </w:pPr>
-      <w:r>
-        <w:rPr>
-          <w:rFonts w:asciiTheme="minorHAnsi" w:hAnsiTheme="minorHAnsi" w:cstheme="minorHAnsi"/>
-        </w:rPr>
-        <w:t xml:space="preserve">The recorded 2018-2022 </w:t>
-      </w:r>
-      <w:proofErr w:type="spellStart"/>
-      <w:r>
-        <w:rPr>
-          <w:rFonts w:asciiTheme="minorHAnsi" w:hAnsiTheme="minorHAnsi" w:cstheme="minorHAnsi"/>
-        </w:rPr>
-        <w:t>backcast</w:t>
-      </w:r>
-      <w:proofErr w:type="spellEnd"/>
-      <w:r>
-        <w:rPr>
-          <w:rFonts w:asciiTheme="minorHAnsi" w:hAnsiTheme="minorHAnsi" w:cstheme="minorHAnsi"/>
-        </w:rPr>
-        <w:t xml:space="preserve"> compared replacement reversion with holding negative baselines flat and with reversing the age multiplier. Among the low-baseline players observed again, 93% improved in the next season and 81% became positive. Replacement reversion had mean absolute errors of 0.364, 0.569, and 0.562 wins at one, two, and three years, against 0.551, 0.733, and 0.662 for holding flat. These results support the chosen rule for the observed group. They do not show that all low-value players recover or that future production has no downside uncertainty.</w:t>
+        <w:t>The model keeps the -0.5 estimate in the valuation season and projects zero WAR, or replacement-level production, in each later season. This rule was selected by comparing ways of handling negative baselines in the backcast described below. Positive baselines that later reach zero use the separate ratio-floor convention described above.</w:t>
+      </w:r>
+    </w:p>
+    <w:p>
+      <w:pPr>
+        <w:spacing w:after="200"/>
+        <w:rPr>
+          <w:rFonts w:asciiTheme="minorHAnsi" w:hAnsiTheme="minorHAnsi" w:cstheme="minorHAnsi"/>
+        </w:rPr>
+      </w:pPr>
+      <w:r>
+        <w:t>The rebound evidence covers players who continued playing. Players who disappeared from the data have no observed next-season production in that comparison, so their exit risk must be handled separately. Zero WAR still has a positive price in the salary equation.</w:t>
+      </w:r>
+    </w:p>
+    <w:p>
+      <w:pPr>
+        <w:spacing w:after="200"/>
+        <w:rPr>
+          <w:rFonts w:asciiTheme="minorHAnsi" w:hAnsiTheme="minorHAnsi" w:cstheme="minorHAnsi"/>
+        </w:rPr>
+      </w:pPr>
+      <w:r>
+        <w:t>The 2018-2022 backcast compared replacement reversion with holding negative baselines flat and with reversing the age multiplier. Among the low-baseline players observed again, 93% improved in the next season and 81% became positive. Replacement reversion had mean absolute errors of 0.364, 0.569, and 0.562 wins at one, two, and three years, against 0.551, 0.733, and 0.662 for holding flat. The rule therefore improved average prediction in this observed group, although individual players could still remain below replacement level.</w:t>
       </w:r>
     </w:p>
     <w:p>
@@ -820,29 +786,29 @@
         </w:rPr>
       </w:pPr>
       <w:r>
-        <w:t>The exit model uses transitions from 2018 through 2024. It groups players by that season's production: below zero WAR, zero to less than one win, one to less than three wins, and at least three wins. It also divides them into five age groups: 22 and under, 23-26, 27-30, 31-34, and 35 or older. There are therefore twenty possible age-and-quality combinations.</w:t>
-      </w:r>
-    </w:p>
-    <w:p>
-      <w:pPr>
-        <w:spacing w:after="200"/>
-        <w:rPr>
-          <w:rFonts w:asciiTheme="minorHAnsi" w:hAnsiTheme="minorHAnsi" w:cstheme="minorHAnsi"/>
-        </w:rPr>
-      </w:pPr>
-      <w:r>
-        <w:t>One way to estimate risk would be to calculate a separate departure rate for each combination. For example, among star players aged 31-34, none of the forty observed player-seasons was followed by an NHL absence. Using that group's departure count alone would assign it zero exit risk. Forty observations with no departure are not enough to establish that a future player in this group is certain to continue.</w:t>
-      </w:r>
-    </w:p>
-    <w:p>
-      <w:pPr>
-        <w:spacing w:after="200"/>
-        <w:rPr>
-          <w:rFonts w:asciiTheme="minorHAnsi" w:hAnsiTheme="minorHAnsi" w:cstheme="minorHAnsi"/>
-        </w:rPr>
-      </w:pPr>
-      <w:r>
-        <w:t>The model instead estimates the relationship between quality and exit across the age groups, and the relationship between age and exit across the quality groups. These relationships are fitted together. A star aged 31-34 is therefore informed by the wider evidence about stars and about players in that age group, rather than only the forty observations at their intersection. The fitted exit probability for this group is about 1.2% a year.</w:t>
+        <w:t>The exit model uses skater transitions from 2018 through 2024. It groups players by that season's production: below zero WAR, zero to less than one win, one to less than three wins, and at least three wins. It also divides them into five age groups: 22 and under, 23-26, 27-30, 31-34, and 35 or older. There are therefore twenty possible age-and-quality combinations. Goalies use a separate table.</w:t>
+      </w:r>
+    </w:p>
+    <w:p>
+      <w:pPr>
+        <w:spacing w:after="200"/>
+        <w:rPr>
+          <w:rFonts w:asciiTheme="minorHAnsi" w:hAnsiTheme="minorHAnsi" w:cstheme="minorHAnsi"/>
+        </w:rPr>
+      </w:pPr>
+      <w:r>
+        <w:t>One way to estimate risk would be to calculate a separate departure rate for each combination. For example, among star players aged 31-34, none of the forty observed player-seasons was followed by an NHL absence. Using that departure count alone would assign zero exit risk to future players in the group, despite the small sample.</w:t>
+      </w:r>
+    </w:p>
+    <w:p>
+      <w:pPr>
+        <w:spacing w:after="200"/>
+        <w:rPr>
+          <w:rFonts w:asciiTheme="minorHAnsi" w:hAnsiTheme="minorHAnsi" w:cstheme="minorHAnsi"/>
+        </w:rPr>
+      </w:pPr>
+      <w:r>
+        <w:t>The model instead estimates the relationship between quality and exit across the age groups, and the relationship between age and exit across the quality groups. These relationships are fitted together. A star aged 31-34 is therefore informed by the wider evidence about stars and about players in that age group. The fitted exit probability is about 1.2% a year, compared with zero departures in the forty observations for that group.</w:t>
       </w:r>
     </w:p>
     <w:p>
@@ -864,21 +830,18 @@
         </w:rPr>
       </w:pPr>
       <w:r>
-        <w:t>A comparison with a more flexible model allowed the age pattern to differ by quality group. The extra flexibility did not improve the fit enough to justify it in the recorded test (p = 0.955), so the simpler model was retained. That result means the data did not provide evidence for those additional differences; it does not prove that stars and fringe players age identically in their exit risk. The transition sample contains 5,346 observations, of which 5,344 have the age information used in this fit. Players with unknown age use the overall observed departure rate for their quality group.</w:t>
-      </w:r>
-    </w:p>
-    <w:p>
-      <w:pPr>
-        <w:spacing w:after="200"/>
-        <w:rPr>
-          <w:rFonts w:asciiTheme="minorHAnsi" w:hAnsiTheme="minorHAnsi" w:cstheme="minorHAnsi"/>
-        </w:rPr>
-      </w:pPr>
-      <w:r>
-        <w:rPr>
-          <w:rFonts w:asciiTheme="minorHAnsi" w:hAnsiTheme="minorHAnsi" w:cstheme="minorHAnsi"/>
-        </w:rPr>
-        <w:t>The boundaries are chosen for interpretability, not recovered from an optimization. A player just below one win can receive a different exit probability from one just above it despite similar underlying ability. In the recorded fitted table, regular players aged 27-30 have an annual exit probability of about 0.94%, compared with 9.37% for fringe players of the same age. That gap makes classification near a boundary consequential. The pandemic transition also needs care because opt-outs, loans, and other temporary absences can be counted as departures.</w:t>
+        <w:t>A comparison with a more flexible model allowed the age pattern to differ by quality group. The test found insufficient evidence to justify those additional terms (p = 0.955), so the simpler model was retained. This does not prove that age affects exit risk identically across quality groups. The transition sample contains 5,346 observations, of which 5,344 have the age information used in the fit. Players with unknown age use the overall observed departure rate for their quality group.</w:t>
+      </w:r>
+    </w:p>
+    <w:p>
+      <w:pPr>
+        <w:spacing w:after="200"/>
+        <w:rPr>
+          <w:rFonts w:asciiTheme="minorHAnsi" w:hAnsiTheme="minorHAnsi" w:cstheme="minorHAnsi"/>
+        </w:rPr>
+      </w:pPr>
+      <w:r>
+        <w:t>The group boundaries were chosen for interpretability. For ages 27-30, the fitted annual exit probability is about 0.94% for regular players and 9.37% for fringe players. Moving from just below one WAR to just above it therefore lowers the model's assigned exit probability roughly tenfold, even when the two production estimates are close. Pandemic-era opt-outs, loans, and other temporary absences can also enter the data as departures.</w:t>
       </w:r>
     </w:p>
     <w:p>
@@ -918,24 +881,7 @@
         </w:rPr>
       </w:pPr>
       <w:r>
-        <w:rPr>
-          <w:rFonts w:asciiTheme="minorHAnsi" w:hAnsiTheme="minorHAnsi" w:cstheme="minorHAnsi"/>
-        </w:rPr>
-        <w:t>This is an approximation to continued NHL participation, not a model of injury, retirement, and temporary absence separately. It treats departure as permanent when accumulating survival probabilities even though some players return. Aging, the replacement-level rule, and exit risk each handle a different part of future production, but their combined behavior still needs checking for players near replacement level.</w:t>
-      </w:r>
-    </w:p>
-    <w:p>
-      <w:pPr>
-        <w:spacing w:after="200"/>
-        <w:rPr>
-          <w:rFonts w:asciiTheme="minorHAnsi" w:hAnsiTheme="minorHAnsi" w:cstheme="minorHAnsi"/>
-        </w:rPr>
-      </w:pPr>
-      <w:r>
-        <w:rPr>
-          <w:rFonts w:asciiTheme="minorHAnsi" w:hAnsiTheme="minorHAnsi" w:cstheme="minorHAnsi"/>
-        </w:rPr>
-        <w:t>The projection also responds slowly to breakouts. A strong season in progress cannot enter a baseline restricted to completed seasons. That protects the historical information rule while leaving the model behind a club that has already seen convincing improvement.</w:t>
+        <w:t>The survival calculation treats departure as permanent, even though some players return. It combines different reasons for next-season absence rather than estimating injury, retirement, and temporary absence separately. Near replacement level, moving a projection to zero WAR also places later hazard lookups in the fringe group. The combined effect of that production rule and the assigned exit rates has not been isolated against observed outcomes.</w:t>
       </w:r>
     </w:p>
     <w:p>
@@ -962,52 +908,40 @@
         </w:rPr>
       </w:pPr>
       <w:r>
-        <w:rPr>
-          <w:rFonts w:asciiTheme="minorHAnsi" w:hAnsiTheme="minorHAnsi" w:cstheme="minorHAnsi"/>
-        </w:rPr>
-        <w:t>The recorded aging-model validation split players across five folds, keeping a held-out player's career together rather than scattering his seasons between training and evaluation. The hybrid curve's mean absolute error was 0.898 wins per 82 games at one year and 1.034 at six years. The previous position-only curve produced 1.048 and 1.264; holding current production flat produced 1.055 and 1.364. Mean absolute error is the average size of a forecast miss, ignoring its sign. These comparisons measure future production among observable outcomes, not the accuracy of the final contract dollar values.</w:t>
-      </w:r>
-    </w:p>
-    <w:p>
-      <w:pPr>
-        <w:spacing w:after="200"/>
-        <w:rPr>
-          <w:rFonts w:asciiTheme="minorHAnsi" w:hAnsiTheme="minorHAnsi" w:cstheme="minorHAnsi"/>
-        </w:rPr>
-      </w:pPr>
-      <w:r>
-        <w:rPr>
-          <w:rFonts w:asciiTheme="minorHAnsi" w:hAnsiTheme="minorHAnsi" w:cstheme="minorHAnsi"/>
-        </w:rPr>
-        <w:t>The 55% weight on the player's own smoothed level was selected in the aging-model validation and checked again after the career data were rebuilt. In that later comparison, average error was 1.0068 at a weight of 0.55, compared with 1.0110 at 0.45 and 1.0095 at 0.65. The nearby settings are close, so the result supports the chosen blend without establishing that 0.55 is uniquely precise. No separate blend has been selected for different player-quality groups.</w:t>
-      </w:r>
-    </w:p>
-    <w:p>
-      <w:pPr>
-        <w:spacing w:after="200"/>
-        <w:rPr>
-          <w:rFonts w:asciiTheme="minorHAnsi" w:hAnsiTheme="minorHAnsi" w:cstheme="minorHAnsi"/>
-        </w:rPr>
-      </w:pPr>
-      <w:r>
-        <w:rPr>
-          <w:rFonts w:asciiTheme="minorHAnsi" w:hAnsiTheme="minorHAnsi" w:cstheme="minorHAnsi"/>
-        </w:rPr>
-        <w:t>That evidence does not validate every weight in the pipeline. The raw 60/40 valuation baseline is a separate choice. A recorded comparison favored a three-season 50/30/20 baseline, but it has not been adopted. Changing it would require a consistent rule for short histories, a new check of the aging blend, and refitting the price equation and downstream values. The comparison gives a reason to revisit the choice; it is not a change already operating in this model.</w:t>
-      </w:r>
-    </w:p>
-    <w:p>
-      <w:pPr>
-        <w:spacing w:after="200"/>
-        <w:rPr>
-          <w:rFonts w:asciiTheme="minorHAnsi" w:hAnsiTheme="minorHAnsi" w:cstheme="minorHAnsi"/>
-        </w:rPr>
-      </w:pPr>
-      <w:r>
-        <w:rPr>
-          <w:rFonts w:asciiTheme="minorHAnsi" w:hAnsiTheme="minorHAnsi" w:cstheme="minorHAnsi"/>
-        </w:rPr>
-        <w:t>These are recorded validation exercises, distinct from the full-panel model used to generate the current historical valuations. The direct exclusion and pooled-profile limitations described above still apply to that production model. A complete historical forecasting test would rebuild the relevant estimates using only data available at each date.</w:t>
+        <w:t>The aging-model validation split players across five folds, keeping a held-out player's career together rather than scattering his seasons between training and evaluation. The hybrid curve's mean absolute error was 0.898 wins per 82 games at one year and 1.034 at six years. The previous position-only curve produced 1.048 and 1.264; holding current production flat produced 1.055 and 1.364. Mean absolute error is the average size of a forecast miss, ignoring its sign. These comparisons measure future production among observable outcomes, not the accuracy of the final contract dollar values.</w:t>
+      </w:r>
+    </w:p>
+    <w:p>
+      <w:pPr>
+        <w:spacing w:after="200"/>
+        <w:rPr>
+          <w:rFonts w:asciiTheme="minorHAnsi" w:hAnsiTheme="minorHAnsi" w:cstheme="minorHAnsi"/>
+        </w:rPr>
+      </w:pPr>
+      <w:r>
+        <w:t>The 55% weight on the player's own smoothed level was selected in the aging-model validation and checked again after the career data were rebuilt. In that later comparison, mean absolute error was 1.0068 at a weight of 0.55, compared with 1.0110 at 0.45 and 1.0095 at 0.65. The selected weight performed best among these nearby alternatives, with small differences between them. No separate blend has been selected for different player-quality groups.</w:t>
+      </w:r>
+    </w:p>
+    <w:p>
+      <w:pPr>
+        <w:spacing w:after="200"/>
+        <w:rPr>
+          <w:rFonts w:asciiTheme="minorHAnsi" w:hAnsiTheme="minorHAnsi" w:cstheme="minorHAnsi"/>
+        </w:rPr>
+      </w:pPr>
+      <w:r>
+        <w:t>The raw 60/40 valuation baseline is a separate choice from the aging blend. A comparison favored a three-season 50/30/20 baseline, which remains a proposed change. Adopting it would require a consistent rule for short histories, a new check of the aging blend, and refitting the price equation and downstream values.</w:t>
+      </w:r>
+    </w:p>
+    <w:p>
+      <w:pPr>
+        <w:spacing w:after="200"/>
+        <w:rPr>
+          <w:rFonts w:asciiTheme="minorHAnsi" w:hAnsiTheme="minorHAnsi" w:cstheme="minorHAnsi"/>
+        </w:rPr>
+      </w:pPr>
+      <w:r>
+        <w:t>These validation exercises assess particular choices within the model. The current historical valuations still use full-panel estimates, including the direct-exclusion and pooled-profile limitations described above. A complete historical forecasting test would rebuild all relevant estimates using only data available at each date.</w:t>
       </w:r>
     </w:p>
     <w:sectPr>

</xml_diff>